<commit_message>
Requisitos: evidencia primaria como hipótesis por validar (C1 a C5)
Co-Authored-By: Claude Opus 5.5 <noreply@anthropic.com>
</commit_message>
<xml_diff>
--- a/entregables/Cartaviva_Documento_Requisitos.docx
+++ b/entregables/Cartaviva_Documento_Requisitos.docx
@@ -2090,7 +2090,16 @@
           <w:sz w:val="22"/>
           <w:szCs w:val="22"/>
         </w:rPr>
-        <w:t xml:space="preserve">Evidencia primaria (completar con las respuestas reales antes de entregar):</w:t>
+        <w:t xml:space="preserve">Evidencia primaria: hipótesis por validar.</w:t>
+      </w:r>
+      <w:r>
+        <w:rPr>
+          <w:rFonts w:ascii="Calibri" w:cs="Calibri" w:eastAsia="Calibri" w:hAnsi="Calibri"/>
+          <w:color w:val="1D3557"/>
+          <w:sz w:val="22"/>
+          <w:szCs w:val="22"/>
+        </w:rPr>
+        <w:t xml:space="preserve"> Estas filas no son resultados: dicen qué esperamos encontrar con la encuesta (anexo A) y las entrevistas (anexo B), y en qué evidencia se basa cada expectativa. Al aplicar los instrumentos, cada hipótesis se confirma o se descarta y la fila se reemplaza por el dato real.</w:t>
       </w:r>
     </w:p>
     <w:tbl>
@@ -2106,12 +2115,12 @@
         </w:tblBorders>
       </w:tblPr>
       <w:tblGrid>
-        <w:gridCol w:w="900"/>
-        <w:gridCol w:w="1500"/>
-        <w:gridCol w:w="1300"/>
-        <w:gridCol w:w="2340"/>
-        <w:gridCol w:w="2300"/>
-        <w:gridCol w:w="1300"/>
+        <w:gridCol w:w="700"/>
+        <w:gridCol w:w="1250"/>
+        <w:gridCol w:w="3290"/>
+        <w:gridCol w:w="2600"/>
+        <w:gridCol w:w="1000"/>
+        <w:gridCol w:w="800"/>
       </w:tblGrid>
       <w:tr>
         <w:trPr>
@@ -2120,7 +2129,7 @@
         </w:trPr>
         <w:tc>
           <w:tcPr>
-            <w:tcW w:type="dxa" w:w="900"/>
+            <w:tcW w:type="dxa" w:w="700"/>
             <w:tcBorders>
               <w:top w:val="single" w:color="C9D4DF" w:sz="4"/>
               <w:left w:val="single" w:color="C9D4DF" w:sz="4"/>
@@ -2152,7 +2161,7 @@
         </w:tc>
         <w:tc>
           <w:tcPr>
-            <w:tcW w:type="dxa" w:w="1500"/>
+            <w:tcW w:type="dxa" w:w="1250"/>
             <w:tcBorders>
               <w:top w:val="single" w:color="C9D4DF" w:sz="4"/>
               <w:left w:val="single" w:color="C9D4DF" w:sz="4"/>
@@ -2184,7 +2193,7 @@
         </w:tc>
         <w:tc>
           <w:tcPr>
-            <w:tcW w:type="dxa" w:w="1300"/>
+            <w:tcW w:type="dxa" w:w="3290"/>
             <w:tcBorders>
               <w:top w:val="single" w:color="C9D4DF" w:sz="4"/>
               <w:left w:val="single" w:color="C9D4DF" w:sz="4"/>
@@ -2210,13 +2219,13 @@
                 <w:sz w:val="18"/>
                 <w:szCs w:val="18"/>
               </w:rPr>
-              <w:t xml:space="preserve">Fecha</w:t>
-            </w:r>
-          </w:p>
-        </w:tc>
-        <w:tc>
-          <w:tcPr>
-            <w:tcW w:type="dxa" w:w="2340"/>
+              <w:t xml:space="preserve">Hipótesis (lo que esperamos encontrar)</w:t>
+            </w:r>
+          </w:p>
+        </w:tc>
+        <w:tc>
+          <w:tcPr>
+            <w:tcW w:type="dxa" w:w="2600"/>
             <w:tcBorders>
               <w:top w:val="single" w:color="C9D4DF" w:sz="4"/>
               <w:left w:val="single" w:color="C9D4DF" w:sz="4"/>
@@ -2242,13 +2251,13 @@
                 <w:sz w:val="18"/>
                 <w:szCs w:val="18"/>
               </w:rPr>
-              <w:t xml:space="preserve">Participante (rol, sin nombre)</w:t>
-            </w:r>
-          </w:p>
-        </w:tc>
-        <w:tc>
-          <w:tcPr>
-            <w:tcW w:type="dxa" w:w="2300"/>
+              <w:t xml:space="preserve">En qué se basa</w:t>
+            </w:r>
+          </w:p>
+        </w:tc>
+        <w:tc>
+          <w:tcPr>
+            <w:tcW w:type="dxa" w:w="1000"/>
             <w:tcBorders>
               <w:top w:val="single" w:color="C9D4DF" w:sz="4"/>
               <w:left w:val="single" w:color="C9D4DF" w:sz="4"/>
@@ -2274,13 +2283,13 @@
                 <w:sz w:val="18"/>
                 <w:szCs w:val="18"/>
               </w:rPr>
-              <w:t xml:space="preserve">Hallazgo</w:t>
-            </w:r>
-          </w:p>
-        </w:tc>
-        <w:tc>
-          <w:tcPr>
-            <w:tcW w:type="dxa" w:w="1300"/>
+              <w:t xml:space="preserve">Estado</w:t>
+            </w:r>
+          </w:p>
+        </w:tc>
+        <w:tc>
+          <w:tcPr>
+            <w:tcW w:type="dxa" w:w="800"/>
             <w:tcBorders>
               <w:top w:val="single" w:color="C9D4DF" w:sz="4"/>
               <w:left w:val="single" w:color="C9D4DF" w:sz="4"/>
@@ -2318,14 +2327,13 @@
         </w:trPr>
         <w:tc>
           <w:tcPr>
-            <w:tcW w:type="dxa" w:w="900"/>
-            <w:tcBorders>
-              <w:top w:val="single" w:color="C9D4DF" w:sz="4"/>
-              <w:left w:val="single" w:color="C9D4DF" w:sz="4"/>
-              <w:bottom w:val="single" w:color="C9D4DF" w:sz="4"/>
-              <w:right w:val="single" w:color="C9D4DF" w:sz="4"/>
-            </w:tcBorders>
-            <w:shd w:fill="FFF4CC" w:color="auto" w:val="clear"/>
+            <w:tcW w:type="dxa" w:w="700"/>
+            <w:tcBorders>
+              <w:top w:val="single" w:color="C9D4DF" w:sz="4"/>
+              <w:left w:val="single" w:color="C9D4DF" w:sz="4"/>
+              <w:bottom w:val="single" w:color="C9D4DF" w:sz="4"/>
+              <w:right w:val="single" w:color="C9D4DF" w:sz="4"/>
+            </w:tcBorders>
             <w:tcMar>
               <w:top w:type="dxa" w:w="60"/>
               <w:left w:type="dxa" w:w="100"/>
@@ -2350,14 +2358,13 @@
         </w:tc>
         <w:tc>
           <w:tcPr>
-            <w:tcW w:type="dxa" w:w="1500"/>
-            <w:tcBorders>
-              <w:top w:val="single" w:color="C9D4DF" w:sz="4"/>
-              <w:left w:val="single" w:color="C9D4DF" w:sz="4"/>
-              <w:bottom w:val="single" w:color="C9D4DF" w:sz="4"/>
-              <w:right w:val="single" w:color="C9D4DF" w:sz="4"/>
-            </w:tcBorders>
-            <w:shd w:fill="FFF4CC" w:color="auto" w:val="clear"/>
+            <w:tcW w:type="dxa" w:w="1250"/>
+            <w:tcBorders>
+              <w:top w:val="single" w:color="C9D4DF" w:sz="4"/>
+              <w:left w:val="single" w:color="C9D4DF" w:sz="4"/>
+              <w:bottom w:val="single" w:color="C9D4DF" w:sz="4"/>
+              <w:right w:val="single" w:color="C9D4DF" w:sz="4"/>
+            </w:tcBorders>
             <w:tcMar>
               <w:top w:type="dxa" w:w="60"/>
               <w:left w:type="dxa" w:w="100"/>
@@ -2376,20 +2383,19 @@
                 <w:sz w:val="18"/>
                 <w:szCs w:val="18"/>
               </w:rPr>
-              <w:t xml:space="preserve">Encuesta</w:t>
-            </w:r>
-          </w:p>
-        </w:tc>
-        <w:tc>
-          <w:tcPr>
-            <w:tcW w:type="dxa" w:w="1300"/>
-            <w:tcBorders>
-              <w:top w:val="single" w:color="C9D4DF" w:sz="4"/>
-              <w:left w:val="single" w:color="C9D4DF" w:sz="4"/>
-              <w:bottom w:val="single" w:color="C9D4DF" w:sz="4"/>
-              <w:right w:val="single" w:color="C9D4DF" w:sz="4"/>
-            </w:tcBorders>
-            <w:shd w:fill="FFF4CC" w:color="auto" w:val="clear"/>
+              <w:t xml:space="preserve">Encuesta, pregunta 2</w:t>
+            </w:r>
+          </w:p>
+        </w:tc>
+        <w:tc>
+          <w:tcPr>
+            <w:tcW w:type="dxa" w:w="3290"/>
+            <w:tcBorders>
+              <w:top w:val="single" w:color="C9D4DF" w:sz="4"/>
+              <w:left w:val="single" w:color="C9D4DF" w:sz="4"/>
+              <w:bottom w:val="single" w:color="C9D4DF" w:sz="4"/>
+              <w:right w:val="single" w:color="C9D4DF" w:sz="4"/>
+            </w:tcBorders>
             <w:tcMar>
               <w:top w:type="dxa" w:w="60"/>
               <w:left w:type="dxa" w:w="100"/>
@@ -2408,20 +2414,19 @@
                 <w:sz w:val="18"/>
                 <w:szCs w:val="18"/>
               </w:rPr>
-              <w:t xml:space="preserve">__/__/2026</w:t>
-            </w:r>
-          </w:p>
-        </w:tc>
-        <w:tc>
-          <w:tcPr>
-            <w:tcW w:type="dxa" w:w="2340"/>
-            <w:tcBorders>
-              <w:top w:val="single" w:color="C9D4DF" w:sz="4"/>
-              <w:left w:val="single" w:color="C9D4DF" w:sz="4"/>
-              <w:bottom w:val="single" w:color="C9D4DF" w:sz="4"/>
-              <w:right w:val="single" w:color="C9D4DF" w:sz="4"/>
-            </w:tcBorders>
-            <w:shd w:fill="FFF4CC" w:color="auto" w:val="clear"/>
+              <w:t xml:space="preserve">Más de la mitad de los encuestados se entera de los eventos por WhatsApp o Instagram, no por canales oficiales.</w:t>
+            </w:r>
+          </w:p>
+        </w:tc>
+        <w:tc>
+          <w:tcPr>
+            <w:tcW w:type="dxa" w:w="2600"/>
+            <w:tcBorders>
+              <w:top w:val="single" w:color="C9D4DF" w:sz="4"/>
+              <w:left w:val="single" w:color="C9D4DF" w:sz="4"/>
+              <w:bottom w:val="single" w:color="C9D4DF" w:sz="4"/>
+              <w:right w:val="single" w:color="C9D4DF" w:sz="4"/>
+            </w:tcBorders>
             <w:tcMar>
               <w:top w:type="dxa" w:w="60"/>
               <w:left w:type="dxa" w:w="100"/>
@@ -2440,13 +2445,13 @@
                 <w:sz w:val="18"/>
                 <w:szCs w:val="18"/>
               </w:rPr>
-              <w:t xml:space="preserve">__ respuestas</w:t>
-            </w:r>
-          </w:p>
-        </w:tc>
-        <w:tc>
-          <w:tcPr>
-            <w:tcW w:type="dxa" w:w="2300"/>
+              <w:t xml:space="preserve">E2: 671 gestores, cada uno con su propia difusión</w:t>
+            </w:r>
+          </w:p>
+        </w:tc>
+        <w:tc>
+          <w:tcPr>
+            <w:tcW w:type="dxa" w:w="1000"/>
             <w:tcBorders>
               <w:top w:val="single" w:color="C9D4DF" w:sz="4"/>
               <w:left w:val="single" w:color="C9D4DF" w:sz="4"/>
@@ -2472,20 +2477,19 @@
                 <w:sz w:val="18"/>
                 <w:szCs w:val="18"/>
               </w:rPr>
-              <w:t xml:space="preserve">__ % se entera por WhatsApp o Instagram</w:t>
-            </w:r>
-          </w:p>
-        </w:tc>
-        <w:tc>
-          <w:tcPr>
-            <w:tcW w:type="dxa" w:w="1300"/>
-            <w:tcBorders>
-              <w:top w:val="single" w:color="C9D4DF" w:sz="4"/>
-              <w:left w:val="single" w:color="C9D4DF" w:sz="4"/>
-              <w:bottom w:val="single" w:color="C9D4DF" w:sz="4"/>
-              <w:right w:val="single" w:color="C9D4DF" w:sz="4"/>
-            </w:tcBorders>
-            <w:shd w:fill="FFF4CC" w:color="auto" w:val="clear"/>
+              <w:t xml:space="preserve">Por validar</w:t>
+            </w:r>
+          </w:p>
+        </w:tc>
+        <w:tc>
+          <w:tcPr>
+            <w:tcW w:type="dxa" w:w="800"/>
+            <w:tcBorders>
+              <w:top w:val="single" w:color="C9D4DF" w:sz="4"/>
+              <w:left w:val="single" w:color="C9D4DF" w:sz="4"/>
+              <w:bottom w:val="single" w:color="C9D4DF" w:sz="4"/>
+              <w:right w:val="single" w:color="C9D4DF" w:sz="4"/>
+            </w:tcBorders>
             <w:tcMar>
               <w:top w:type="dxa" w:w="60"/>
               <w:left w:type="dxa" w:w="100"/>
@@ -2516,14 +2520,14 @@
         </w:trPr>
         <w:tc>
           <w:tcPr>
-            <w:tcW w:type="dxa" w:w="900"/>
-            <w:tcBorders>
-              <w:top w:val="single" w:color="C9D4DF" w:sz="4"/>
-              <w:left w:val="single" w:color="C9D4DF" w:sz="4"/>
-              <w:bottom w:val="single" w:color="C9D4DF" w:sz="4"/>
-              <w:right w:val="single" w:color="C9D4DF" w:sz="4"/>
-            </w:tcBorders>
-            <w:shd w:fill="FFF4CC" w:color="auto" w:val="clear"/>
+            <w:tcW w:type="dxa" w:w="700"/>
+            <w:tcBorders>
+              <w:top w:val="single" w:color="C9D4DF" w:sz="4"/>
+              <w:left w:val="single" w:color="C9D4DF" w:sz="4"/>
+              <w:bottom w:val="single" w:color="C9D4DF" w:sz="4"/>
+              <w:right w:val="single" w:color="C9D4DF" w:sz="4"/>
+            </w:tcBorders>
+            <w:shd w:fill="EEF3F8" w:color="auto" w:val="clear"/>
             <w:tcMar>
               <w:top w:type="dxa" w:w="60"/>
               <w:left w:type="dxa" w:w="100"/>
@@ -2548,14 +2552,14 @@
         </w:tc>
         <w:tc>
           <w:tcPr>
-            <w:tcW w:type="dxa" w:w="1500"/>
-            <w:tcBorders>
-              <w:top w:val="single" w:color="C9D4DF" w:sz="4"/>
-              <w:left w:val="single" w:color="C9D4DF" w:sz="4"/>
-              <w:bottom w:val="single" w:color="C9D4DF" w:sz="4"/>
-              <w:right w:val="single" w:color="C9D4DF" w:sz="4"/>
-            </w:tcBorders>
-            <w:shd w:fill="FFF4CC" w:color="auto" w:val="clear"/>
+            <w:tcW w:type="dxa" w:w="1250"/>
+            <w:tcBorders>
+              <w:top w:val="single" w:color="C9D4DF" w:sz="4"/>
+              <w:left w:val="single" w:color="C9D4DF" w:sz="4"/>
+              <w:bottom w:val="single" w:color="C9D4DF" w:sz="4"/>
+              <w:right w:val="single" w:color="C9D4DF" w:sz="4"/>
+            </w:tcBorders>
+            <w:shd w:fill="EEF3F8" w:color="auto" w:val="clear"/>
             <w:tcMar>
               <w:top w:type="dxa" w:w="60"/>
               <w:left w:type="dxa" w:w="100"/>
@@ -2574,20 +2578,20 @@
                 <w:sz w:val="18"/>
                 <w:szCs w:val="18"/>
               </w:rPr>
-              <w:t xml:space="preserve">Encuesta</w:t>
-            </w:r>
-          </w:p>
-        </w:tc>
-        <w:tc>
-          <w:tcPr>
-            <w:tcW w:type="dxa" w:w="1300"/>
-            <w:tcBorders>
-              <w:top w:val="single" w:color="C9D4DF" w:sz="4"/>
-              <w:left w:val="single" w:color="C9D4DF" w:sz="4"/>
-              <w:bottom w:val="single" w:color="C9D4DF" w:sz="4"/>
-              <w:right w:val="single" w:color="C9D4DF" w:sz="4"/>
-            </w:tcBorders>
-            <w:shd w:fill="FFF4CC" w:color="auto" w:val="clear"/>
+              <w:t xml:space="preserve">Encuesta, pregunta 4</w:t>
+            </w:r>
+          </w:p>
+        </w:tc>
+        <w:tc>
+          <w:tcPr>
+            <w:tcW w:type="dxa" w:w="3290"/>
+            <w:tcBorders>
+              <w:top w:val="single" w:color="C9D4DF" w:sz="4"/>
+              <w:left w:val="single" w:color="C9D4DF" w:sz="4"/>
+              <w:bottom w:val="single" w:color="C9D4DF" w:sz="4"/>
+              <w:right w:val="single" w:color="C9D4DF" w:sz="4"/>
+            </w:tcBorders>
+            <w:shd w:fill="EEF3F8" w:color="auto" w:val="clear"/>
             <w:tcMar>
               <w:top w:type="dxa" w:w="60"/>
               <w:left w:type="dxa" w:w="100"/>
@@ -2606,20 +2610,20 @@
                 <w:sz w:val="18"/>
                 <w:szCs w:val="18"/>
               </w:rPr>
-              <w:t xml:space="preserve">__/__/2026</w:t>
-            </w:r>
-          </w:p>
-        </w:tc>
-        <w:tc>
-          <w:tcPr>
-            <w:tcW w:type="dxa" w:w="2340"/>
-            <w:tcBorders>
-              <w:top w:val="single" w:color="C9D4DF" w:sz="4"/>
-              <w:left w:val="single" w:color="C9D4DF" w:sz="4"/>
-              <w:bottom w:val="single" w:color="C9D4DF" w:sz="4"/>
-              <w:right w:val="single" w:color="C9D4DF" w:sz="4"/>
-            </w:tcBorders>
-            <w:shd w:fill="FFF4CC" w:color="auto" w:val="clear"/>
+              <w:t xml:space="preserve">Al menos 1 de cada 4 encuestados se ha inscrito a un evento gratuito y no fue.</w:t>
+            </w:r>
+          </w:p>
+        </w:tc>
+        <w:tc>
+          <w:tcPr>
+            <w:tcW w:type="dxa" w:w="2600"/>
+            <w:tcBorders>
+              <w:top w:val="single" w:color="C9D4DF" w:sz="4"/>
+              <w:left w:val="single" w:color="C9D4DF" w:sz="4"/>
+              <w:bottom w:val="single" w:color="C9D4DF" w:sz="4"/>
+              <w:right w:val="single" w:color="C9D4DF" w:sz="4"/>
+            </w:tcBorders>
+            <w:shd w:fill="EEF3F8" w:color="auto" w:val="clear"/>
             <w:tcMar>
               <w:top w:type="dxa" w:w="60"/>
               <w:left w:type="dxa" w:w="100"/>
@@ -2638,13 +2642,13 @@
                 <w:sz w:val="18"/>
                 <w:szCs w:val="18"/>
               </w:rPr>
-              <w:t xml:space="preserve">__ respuestas</w:t>
-            </w:r>
-          </w:p>
-        </w:tc>
-        <w:tc>
-          <w:tcPr>
-            <w:tcW w:type="dxa" w:w="2300"/>
+              <w:t xml:space="preserve">E3: el 28 % de los inscritos a eventos gratuitos no llega</w:t>
+            </w:r>
+          </w:p>
+        </w:tc>
+        <w:tc>
+          <w:tcPr>
+            <w:tcW w:type="dxa" w:w="1000"/>
             <w:tcBorders>
               <w:top w:val="single" w:color="C9D4DF" w:sz="4"/>
               <w:left w:val="single" w:color="C9D4DF" w:sz="4"/>
@@ -2670,20 +2674,20 @@
                 <w:sz w:val="18"/>
                 <w:szCs w:val="18"/>
               </w:rPr>
-              <w:t xml:space="preserve">__ % se inscribió a un evento gratuito y no fue</w:t>
-            </w:r>
-          </w:p>
-        </w:tc>
-        <w:tc>
-          <w:tcPr>
-            <w:tcW w:type="dxa" w:w="1300"/>
-            <w:tcBorders>
-              <w:top w:val="single" w:color="C9D4DF" w:sz="4"/>
-              <w:left w:val="single" w:color="C9D4DF" w:sz="4"/>
-              <w:bottom w:val="single" w:color="C9D4DF" w:sz="4"/>
-              <w:right w:val="single" w:color="C9D4DF" w:sz="4"/>
-            </w:tcBorders>
-            <w:shd w:fill="FFF4CC" w:color="auto" w:val="clear"/>
+              <w:t xml:space="preserve">Por validar</w:t>
+            </w:r>
+          </w:p>
+        </w:tc>
+        <w:tc>
+          <w:tcPr>
+            <w:tcW w:type="dxa" w:w="800"/>
+            <w:tcBorders>
+              <w:top w:val="single" w:color="C9D4DF" w:sz="4"/>
+              <w:left w:val="single" w:color="C9D4DF" w:sz="4"/>
+              <w:bottom w:val="single" w:color="C9D4DF" w:sz="4"/>
+              <w:right w:val="single" w:color="C9D4DF" w:sz="4"/>
+            </w:tcBorders>
+            <w:shd w:fill="EEF3F8" w:color="auto" w:val="clear"/>
             <w:tcMar>
               <w:top w:type="dxa" w:w="60"/>
               <w:left w:type="dxa" w:w="100"/>
@@ -2714,14 +2718,13 @@
         </w:trPr>
         <w:tc>
           <w:tcPr>
-            <w:tcW w:type="dxa" w:w="900"/>
-            <w:tcBorders>
-              <w:top w:val="single" w:color="C9D4DF" w:sz="4"/>
-              <w:left w:val="single" w:color="C9D4DF" w:sz="4"/>
-              <w:bottom w:val="single" w:color="C9D4DF" w:sz="4"/>
-              <w:right w:val="single" w:color="C9D4DF" w:sz="4"/>
-            </w:tcBorders>
-            <w:shd w:fill="FFF4CC" w:color="auto" w:val="clear"/>
+            <w:tcW w:type="dxa" w:w="700"/>
+            <w:tcBorders>
+              <w:top w:val="single" w:color="C9D4DF" w:sz="4"/>
+              <w:left w:val="single" w:color="C9D4DF" w:sz="4"/>
+              <w:bottom w:val="single" w:color="C9D4DF" w:sz="4"/>
+              <w:right w:val="single" w:color="C9D4DF" w:sz="4"/>
+            </w:tcBorders>
             <w:tcMar>
               <w:top w:type="dxa" w:w="60"/>
               <w:left w:type="dxa" w:w="100"/>
@@ -2746,14 +2749,13 @@
         </w:tc>
         <w:tc>
           <w:tcPr>
-            <w:tcW w:type="dxa" w:w="1500"/>
-            <w:tcBorders>
-              <w:top w:val="single" w:color="C9D4DF" w:sz="4"/>
-              <w:left w:val="single" w:color="C9D4DF" w:sz="4"/>
-              <w:bottom w:val="single" w:color="C9D4DF" w:sz="4"/>
-              <w:right w:val="single" w:color="C9D4DF" w:sz="4"/>
-            </w:tcBorders>
-            <w:shd w:fill="FFF4CC" w:color="auto" w:val="clear"/>
+            <w:tcW w:type="dxa" w:w="1250"/>
+            <w:tcBorders>
+              <w:top w:val="single" w:color="C9D4DF" w:sz="4"/>
+              <w:left w:val="single" w:color="C9D4DF" w:sz="4"/>
+              <w:bottom w:val="single" w:color="C9D4DF" w:sz="4"/>
+              <w:right w:val="single" w:color="C9D4DF" w:sz="4"/>
+            </w:tcBorders>
             <w:tcMar>
               <w:top w:type="dxa" w:w="60"/>
               <w:left w:type="dxa" w:w="100"/>
@@ -2772,20 +2774,19 @@
                 <w:sz w:val="18"/>
                 <w:szCs w:val="18"/>
               </w:rPr>
-              <w:t xml:space="preserve">Encuesta</w:t>
-            </w:r>
-          </w:p>
-        </w:tc>
-        <w:tc>
-          <w:tcPr>
-            <w:tcW w:type="dxa" w:w="1300"/>
-            <w:tcBorders>
-              <w:top w:val="single" w:color="C9D4DF" w:sz="4"/>
-              <w:left w:val="single" w:color="C9D4DF" w:sz="4"/>
-              <w:bottom w:val="single" w:color="C9D4DF" w:sz="4"/>
-              <w:right w:val="single" w:color="C9D4DF" w:sz="4"/>
-            </w:tcBorders>
-            <w:shd w:fill="FFF4CC" w:color="auto" w:val="clear"/>
+              <w:t xml:space="preserve">Encuesta, preguntas 5 y 6</w:t>
+            </w:r>
+          </w:p>
+        </w:tc>
+        <w:tc>
+          <w:tcPr>
+            <w:tcW w:type="dxa" w:w="3290"/>
+            <w:tcBorders>
+              <w:top w:val="single" w:color="C9D4DF" w:sz="4"/>
+              <w:left w:val="single" w:color="C9D4DF" w:sz="4"/>
+              <w:bottom w:val="single" w:color="C9D4DF" w:sz="4"/>
+              <w:right w:val="single" w:color="C9D4DF" w:sz="4"/>
+            </w:tcBorders>
             <w:tcMar>
               <w:top w:type="dxa" w:w="60"/>
               <w:left w:type="dxa" w:w="100"/>
@@ -2804,20 +2805,19 @@
                 <w:sz w:val="18"/>
                 <w:szCs w:val="18"/>
               </w:rPr>
-              <w:t xml:space="preserve">__/__/2026</w:t>
-            </w:r>
-          </w:p>
-        </w:tc>
-        <w:tc>
-          <w:tcPr>
-            <w:tcW w:type="dxa" w:w="2340"/>
-            <w:tcBorders>
-              <w:top w:val="single" w:color="C9D4DF" w:sz="4"/>
-              <w:left w:val="single" w:color="C9D4DF" w:sz="4"/>
-              <w:bottom w:val="single" w:color="C9D4DF" w:sz="4"/>
-              <w:right w:val="single" w:color="C9D4DF" w:sz="4"/>
-            </w:tcBorders>
-            <w:shd w:fill="FFF4CC" w:color="auto" w:val="clear"/>
+              <w:t xml:space="preserve">A más de la mitad le han pedido cédula o teléfono para entrar y se siente poco cómoda (1 o 2 de 5).</w:t>
+            </w:r>
+          </w:p>
+        </w:tc>
+        <w:tc>
+          <w:tcPr>
+            <w:tcW w:type="dxa" w:w="2600"/>
+            <w:tcBorders>
+              <w:top w:val="single" w:color="C9D4DF" w:sz="4"/>
+              <w:left w:val="single" w:color="C9D4DF" w:sz="4"/>
+              <w:bottom w:val="single" w:color="C9D4DF" w:sz="4"/>
+              <w:right w:val="single" w:color="C9D4DF" w:sz="4"/>
+            </w:tcBorders>
             <w:tcMar>
               <w:top w:type="dxa" w:w="60"/>
               <w:left w:type="dxa" w:w="100"/>
@@ -2836,13 +2836,13 @@
                 <w:sz w:val="18"/>
                 <w:szCs w:val="18"/>
               </w:rPr>
-              <w:t xml:space="preserve">__ respuestas</w:t>
-            </w:r>
-          </w:p>
-        </w:tc>
-        <w:tc>
-          <w:tcPr>
-            <w:tcW w:type="dxa" w:w="2300"/>
+              <w:t xml:space="preserve">E5: la SIC sanciona el uso de datos sin autorización</w:t>
+            </w:r>
+          </w:p>
+        </w:tc>
+        <w:tc>
+          <w:tcPr>
+            <w:tcW w:type="dxa" w:w="1000"/>
             <w:tcBorders>
               <w:top w:val="single" w:color="C9D4DF" w:sz="4"/>
               <w:left w:val="single" w:color="C9D4DF" w:sz="4"/>
@@ -2868,20 +2868,19 @@
                 <w:sz w:val="18"/>
                 <w:szCs w:val="18"/>
               </w:rPr>
-              <w:t xml:space="preserve">__ % le han pedido cédula o teléfono para entrar</w:t>
-            </w:r>
-          </w:p>
-        </w:tc>
-        <w:tc>
-          <w:tcPr>
-            <w:tcW w:type="dxa" w:w="1300"/>
-            <w:tcBorders>
-              <w:top w:val="single" w:color="C9D4DF" w:sz="4"/>
-              <w:left w:val="single" w:color="C9D4DF" w:sz="4"/>
-              <w:bottom w:val="single" w:color="C9D4DF" w:sz="4"/>
-              <w:right w:val="single" w:color="C9D4DF" w:sz="4"/>
-            </w:tcBorders>
-            <w:shd w:fill="FFF4CC" w:color="auto" w:val="clear"/>
+              <w:t xml:space="preserve">Por validar</w:t>
+            </w:r>
+          </w:p>
+        </w:tc>
+        <w:tc>
+          <w:tcPr>
+            <w:tcW w:type="dxa" w:w="800"/>
+            <w:tcBorders>
+              <w:top w:val="single" w:color="C9D4DF" w:sz="4"/>
+              <w:left w:val="single" w:color="C9D4DF" w:sz="4"/>
+              <w:bottom w:val="single" w:color="C9D4DF" w:sz="4"/>
+              <w:right w:val="single" w:color="C9D4DF" w:sz="4"/>
+            </w:tcBorders>
             <w:tcMar>
               <w:top w:type="dxa" w:w="60"/>
               <w:left w:type="dxa" w:w="100"/>
@@ -2912,14 +2911,14 @@
         </w:trPr>
         <w:tc>
           <w:tcPr>
-            <w:tcW w:type="dxa" w:w="900"/>
-            <w:tcBorders>
-              <w:top w:val="single" w:color="C9D4DF" w:sz="4"/>
-              <w:left w:val="single" w:color="C9D4DF" w:sz="4"/>
-              <w:bottom w:val="single" w:color="C9D4DF" w:sz="4"/>
-              <w:right w:val="single" w:color="C9D4DF" w:sz="4"/>
-            </w:tcBorders>
-            <w:shd w:fill="FFF4CC" w:color="auto" w:val="clear"/>
+            <w:tcW w:type="dxa" w:w="700"/>
+            <w:tcBorders>
+              <w:top w:val="single" w:color="C9D4DF" w:sz="4"/>
+              <w:left w:val="single" w:color="C9D4DF" w:sz="4"/>
+              <w:bottom w:val="single" w:color="C9D4DF" w:sz="4"/>
+              <w:right w:val="single" w:color="C9D4DF" w:sz="4"/>
+            </w:tcBorders>
+            <w:shd w:fill="EEF3F8" w:color="auto" w:val="clear"/>
             <w:tcMar>
               <w:top w:type="dxa" w:w="60"/>
               <w:left w:type="dxa" w:w="100"/>
@@ -2944,14 +2943,14 @@
         </w:tc>
         <w:tc>
           <w:tcPr>
-            <w:tcW w:type="dxa" w:w="1500"/>
-            <w:tcBorders>
-              <w:top w:val="single" w:color="C9D4DF" w:sz="4"/>
-              <w:left w:val="single" w:color="C9D4DF" w:sz="4"/>
-              <w:bottom w:val="single" w:color="C9D4DF" w:sz="4"/>
-              <w:right w:val="single" w:color="C9D4DF" w:sz="4"/>
-            </w:tcBorders>
-            <w:shd w:fill="FFF4CC" w:color="auto" w:val="clear"/>
+            <w:tcW w:type="dxa" w:w="1250"/>
+            <w:tcBorders>
+              <w:top w:val="single" w:color="C9D4DF" w:sz="4"/>
+              <w:left w:val="single" w:color="C9D4DF" w:sz="4"/>
+              <w:bottom w:val="single" w:color="C9D4DF" w:sz="4"/>
+              <w:right w:val="single" w:color="C9D4DF" w:sz="4"/>
+            </w:tcBorders>
+            <w:shd w:fill="EEF3F8" w:color="auto" w:val="clear"/>
             <w:tcMar>
               <w:top w:type="dxa" w:w="60"/>
               <w:left w:type="dxa" w:w="100"/>
@@ -2970,20 +2969,20 @@
                 <w:sz w:val="18"/>
                 <w:szCs w:val="18"/>
               </w:rPr>
-              <w:t xml:space="preserve">Entrevista</w:t>
-            </w:r>
-          </w:p>
-        </w:tc>
-        <w:tc>
-          <w:tcPr>
-            <w:tcW w:type="dxa" w:w="1300"/>
-            <w:tcBorders>
-              <w:top w:val="single" w:color="C9D4DF" w:sz="4"/>
-              <w:left w:val="single" w:color="C9D4DF" w:sz="4"/>
-              <w:bottom w:val="single" w:color="C9D4DF" w:sz="4"/>
-              <w:right w:val="single" w:color="C9D4DF" w:sz="4"/>
-            </w:tcBorders>
-            <w:shd w:fill="FFF4CC" w:color="auto" w:val="clear"/>
+              <w:t xml:space="preserve">Entrevista, pregunta 3</w:t>
+            </w:r>
+          </w:p>
+        </w:tc>
+        <w:tc>
+          <w:tcPr>
+            <w:tcW w:type="dxa" w:w="3290"/>
+            <w:tcBorders>
+              <w:top w:val="single" w:color="C9D4DF" w:sz="4"/>
+              <w:left w:val="single" w:color="C9D4DF" w:sz="4"/>
+              <w:bottom w:val="single" w:color="C9D4DF" w:sz="4"/>
+              <w:right w:val="single" w:color="C9D4DF" w:sz="4"/>
+            </w:tcBorders>
+            <w:shd w:fill="EEF3F8" w:color="auto" w:val="clear"/>
             <w:tcMar>
               <w:top w:type="dxa" w:w="60"/>
               <w:left w:type="dxa" w:w="100"/>
@@ -3002,20 +3001,20 @@
                 <w:sz w:val="18"/>
                 <w:szCs w:val="18"/>
               </w:rPr>
-              <w:t xml:space="preserve">__/__/2026</w:t>
-            </w:r>
-          </w:p>
-        </w:tc>
-        <w:tc>
-          <w:tcPr>
-            <w:tcW w:type="dxa" w:w="2340"/>
-            <w:tcBorders>
-              <w:top w:val="single" w:color="C9D4DF" w:sz="4"/>
-              <w:left w:val="single" w:color="C9D4DF" w:sz="4"/>
-              <w:bottom w:val="single" w:color="C9D4DF" w:sz="4"/>
-              <w:right w:val="single" w:color="C9D4DF" w:sz="4"/>
-            </w:tcBorders>
-            <w:shd w:fill="FFF4CC" w:color="auto" w:val="clear"/>
+              <w:t xml:space="preserve">Los organizadores controlan la entrada con listas en papel o en WhatsApp que incluyen nombre y teléfono.</w:t>
+            </w:r>
+          </w:p>
+        </w:tc>
+        <w:tc>
+          <w:tcPr>
+            <w:tcW w:type="dxa" w:w="2600"/>
+            <w:tcBorders>
+              <w:top w:val="single" w:color="C9D4DF" w:sz="4"/>
+              <w:left w:val="single" w:color="C9D4DF" w:sz="4"/>
+              <w:bottom w:val="single" w:color="C9D4DF" w:sz="4"/>
+              <w:right w:val="single" w:color="C9D4DF" w:sz="4"/>
+            </w:tcBorders>
+            <w:shd w:fill="EEF3F8" w:color="auto" w:val="clear"/>
             <w:tcMar>
               <w:top w:type="dxa" w:w="60"/>
               <w:left w:type="dxa" w:w="100"/>
@@ -3034,13 +3033,13 @@
                 <w:sz w:val="18"/>
                 <w:szCs w:val="18"/>
               </w:rPr>
-              <w:t xml:space="preserve">Organizador 1 (tipo de organización)</w:t>
-            </w:r>
-          </w:p>
-        </w:tc>
-        <w:tc>
-          <w:tcPr>
-            <w:tcW w:type="dxa" w:w="2300"/>
+              <w:t xml:space="preserve">Problema descrito en la ficha (Entregable 1)</w:t>
+            </w:r>
+          </w:p>
+        </w:tc>
+        <w:tc>
+          <w:tcPr>
+            <w:tcW w:type="dxa" w:w="1000"/>
             <w:tcBorders>
               <w:top w:val="single" w:color="C9D4DF" w:sz="4"/>
               <w:left w:val="single" w:color="C9D4DF" w:sz="4"/>
@@ -3059,29 +3058,47 @@
             <w:pPr>
               <w:spacing w:after="0" w:line="252"/>
             </w:pPr>
-          </w:p>
-        </w:tc>
-        <w:tc>
-          <w:tcPr>
-            <w:tcW w:type="dxa" w:w="1300"/>
-            <w:tcBorders>
-              <w:top w:val="single" w:color="C9D4DF" w:sz="4"/>
-              <w:left w:val="single" w:color="C9D4DF" w:sz="4"/>
-              <w:bottom w:val="single" w:color="C9D4DF" w:sz="4"/>
-              <w:right w:val="single" w:color="C9D4DF" w:sz="4"/>
-            </w:tcBorders>
-            <w:shd w:fill="FFF4CC" w:color="auto" w:val="clear"/>
-            <w:tcMar>
-              <w:top w:type="dxa" w:w="60"/>
-              <w:left w:type="dxa" w:w="100"/>
-              <w:bottom w:type="dxa" w:w="60"/>
-              <w:right w:type="dxa" w:w="100"/>
-            </w:tcMar>
-          </w:tcPr>
-          <w:p>
-            <w:pPr>
-              <w:spacing w:after="0" w:line="252"/>
-            </w:pPr>
+            <w:r>
+              <w:rPr>
+                <w:rFonts w:ascii="Calibri" w:cs="Calibri" w:eastAsia="Calibri" w:hAnsi="Calibri"/>
+                <w:color w:val="1D3557"/>
+                <w:sz w:val="18"/>
+                <w:szCs w:val="18"/>
+              </w:rPr>
+              <w:t xml:space="preserve">Por validar</w:t>
+            </w:r>
+          </w:p>
+        </w:tc>
+        <w:tc>
+          <w:tcPr>
+            <w:tcW w:type="dxa" w:w="800"/>
+            <w:tcBorders>
+              <w:top w:val="single" w:color="C9D4DF" w:sz="4"/>
+              <w:left w:val="single" w:color="C9D4DF" w:sz="4"/>
+              <w:bottom w:val="single" w:color="C9D4DF" w:sz="4"/>
+              <w:right w:val="single" w:color="C9D4DF" w:sz="4"/>
+            </w:tcBorders>
+            <w:shd w:fill="EEF3F8" w:color="auto" w:val="clear"/>
+            <w:tcMar>
+              <w:top w:type="dxa" w:w="60"/>
+              <w:left w:type="dxa" w:w="100"/>
+              <w:bottom w:type="dxa" w:w="60"/>
+              <w:right w:type="dxa" w:w="100"/>
+            </w:tcMar>
+          </w:tcPr>
+          <w:p>
+            <w:pPr>
+              <w:spacing w:after="0" w:line="252"/>
+            </w:pPr>
+            <w:r>
+              <w:rPr>
+                <w:rFonts w:ascii="Calibri" w:cs="Calibri" w:eastAsia="Calibri" w:hAnsi="Calibri"/>
+                <w:color w:val="1D3557"/>
+                <w:sz w:val="18"/>
+                <w:szCs w:val="18"/>
+              </w:rPr>
+              <w:t xml:space="preserve">N3, N5</w:t>
+            </w:r>
           </w:p>
         </w:tc>
       </w:tr>
@@ -3092,14 +3109,13 @@
         </w:trPr>
         <w:tc>
           <w:tcPr>
-            <w:tcW w:type="dxa" w:w="900"/>
-            <w:tcBorders>
-              <w:top w:val="single" w:color="C9D4DF" w:sz="4"/>
-              <w:left w:val="single" w:color="C9D4DF" w:sz="4"/>
-              <w:bottom w:val="single" w:color="C9D4DF" w:sz="4"/>
-              <w:right w:val="single" w:color="C9D4DF" w:sz="4"/>
-            </w:tcBorders>
-            <w:shd w:fill="FFF4CC" w:color="auto" w:val="clear"/>
+            <w:tcW w:type="dxa" w:w="700"/>
+            <w:tcBorders>
+              <w:top w:val="single" w:color="C9D4DF" w:sz="4"/>
+              <w:left w:val="single" w:color="C9D4DF" w:sz="4"/>
+              <w:bottom w:val="single" w:color="C9D4DF" w:sz="4"/>
+              <w:right w:val="single" w:color="C9D4DF" w:sz="4"/>
+            </w:tcBorders>
             <w:tcMar>
               <w:top w:type="dxa" w:w="60"/>
               <w:left w:type="dxa" w:w="100"/>
@@ -3124,14 +3140,13 @@
         </w:tc>
         <w:tc>
           <w:tcPr>
-            <w:tcW w:type="dxa" w:w="1500"/>
-            <w:tcBorders>
-              <w:top w:val="single" w:color="C9D4DF" w:sz="4"/>
-              <w:left w:val="single" w:color="C9D4DF" w:sz="4"/>
-              <w:bottom w:val="single" w:color="C9D4DF" w:sz="4"/>
-              <w:right w:val="single" w:color="C9D4DF" w:sz="4"/>
-            </w:tcBorders>
-            <w:shd w:fill="FFF4CC" w:color="auto" w:val="clear"/>
+            <w:tcW w:type="dxa" w:w="1250"/>
+            <w:tcBorders>
+              <w:top w:val="single" w:color="C9D4DF" w:sz="4"/>
+              <w:left w:val="single" w:color="C9D4DF" w:sz="4"/>
+              <w:bottom w:val="single" w:color="C9D4DF" w:sz="4"/>
+              <w:right w:val="single" w:color="C9D4DF" w:sz="4"/>
+            </w:tcBorders>
             <w:tcMar>
               <w:top w:type="dxa" w:w="60"/>
               <w:left w:type="dxa" w:w="100"/>
@@ -3150,20 +3165,19 @@
                 <w:sz w:val="18"/>
                 <w:szCs w:val="18"/>
               </w:rPr>
-              <w:t xml:space="preserve">Entrevista</w:t>
-            </w:r>
-          </w:p>
-        </w:tc>
-        <w:tc>
-          <w:tcPr>
-            <w:tcW w:type="dxa" w:w="1300"/>
-            <w:tcBorders>
-              <w:top w:val="single" w:color="C9D4DF" w:sz="4"/>
-              <w:left w:val="single" w:color="C9D4DF" w:sz="4"/>
-              <w:bottom w:val="single" w:color="C9D4DF" w:sz="4"/>
-              <w:right w:val="single" w:color="C9D4DF" w:sz="4"/>
-            </w:tcBorders>
-            <w:shd w:fill="FFF4CC" w:color="auto" w:val="clear"/>
+              <w:t xml:space="preserve">Entrevista, pregunta 4</w:t>
+            </w:r>
+          </w:p>
+        </w:tc>
+        <w:tc>
+          <w:tcPr>
+            <w:tcW w:type="dxa" w:w="3290"/>
+            <w:tcBorders>
+              <w:top w:val="single" w:color="C9D4DF" w:sz="4"/>
+              <w:left w:val="single" w:color="C9D4DF" w:sz="4"/>
+              <w:bottom w:val="single" w:color="C9D4DF" w:sz="4"/>
+              <w:right w:val="single" w:color="C9D4DF" w:sz="4"/>
+            </w:tcBorders>
             <w:tcMar>
               <w:top w:type="dxa" w:w="60"/>
               <w:left w:type="dxa" w:w="100"/>
@@ -3182,20 +3196,19 @@
                 <w:sz w:val="18"/>
                 <w:szCs w:val="18"/>
               </w:rPr>
-              <w:t xml:space="preserve">__/__/2026</w:t>
-            </w:r>
-          </w:p>
-        </w:tc>
-        <w:tc>
-          <w:tcPr>
-            <w:tcW w:type="dxa" w:w="2340"/>
-            <w:tcBorders>
-              <w:top w:val="single" w:color="C9D4DF" w:sz="4"/>
-              <w:left w:val="single" w:color="C9D4DF" w:sz="4"/>
-              <w:bottom w:val="single" w:color="C9D4DF" w:sz="4"/>
-              <w:right w:val="single" w:color="C9D4DF" w:sz="4"/>
-            </w:tcBorders>
-            <w:shd w:fill="FFF4CC" w:color="auto" w:val="clear"/>
+              <w:t xml:space="preserve">Los organizadores no saben con precisión cuántas personas llegan frente a las que confirmaron.</w:t>
+            </w:r>
+          </w:p>
+        </w:tc>
+        <w:tc>
+          <w:tcPr>
+            <w:tcW w:type="dxa" w:w="2600"/>
+            <w:tcBorders>
+              <w:top w:val="single" w:color="C9D4DF" w:sz="4"/>
+              <w:left w:val="single" w:color="C9D4DF" w:sz="4"/>
+              <w:bottom w:val="single" w:color="C9D4DF" w:sz="4"/>
+              <w:right w:val="single" w:color="C9D4DF" w:sz="4"/>
+            </w:tcBorders>
             <w:tcMar>
               <w:top w:type="dxa" w:w="60"/>
               <w:left w:type="dxa" w:w="100"/>
@@ -3214,13 +3227,13 @@
                 <w:sz w:val="18"/>
                 <w:szCs w:val="18"/>
               </w:rPr>
-              <w:t xml:space="preserve">Organizador 2 (tipo de organización)</w:t>
-            </w:r>
-          </w:p>
-        </w:tc>
-        <w:tc>
-          <w:tcPr>
-            <w:tcW w:type="dxa" w:w="2300"/>
+              <w:t xml:space="preserve">E3: inasistencia del 17 % al 28 %</w:t>
+            </w:r>
+          </w:p>
+        </w:tc>
+        <w:tc>
+          <w:tcPr>
+            <w:tcW w:type="dxa" w:w="1000"/>
             <w:tcBorders>
               <w:top w:val="single" w:color="C9D4DF" w:sz="4"/>
               <w:left w:val="single" w:color="C9D4DF" w:sz="4"/>
@@ -3239,29 +3252,46 @@
             <w:pPr>
               <w:spacing w:after="0" w:line="252"/>
             </w:pPr>
-          </w:p>
-        </w:tc>
-        <w:tc>
-          <w:tcPr>
-            <w:tcW w:type="dxa" w:w="1300"/>
-            <w:tcBorders>
-              <w:top w:val="single" w:color="C9D4DF" w:sz="4"/>
-              <w:left w:val="single" w:color="C9D4DF" w:sz="4"/>
-              <w:bottom w:val="single" w:color="C9D4DF" w:sz="4"/>
-              <w:right w:val="single" w:color="C9D4DF" w:sz="4"/>
-            </w:tcBorders>
-            <w:shd w:fill="FFF4CC" w:color="auto" w:val="clear"/>
-            <w:tcMar>
-              <w:top w:type="dxa" w:w="60"/>
-              <w:left w:type="dxa" w:w="100"/>
-              <w:bottom w:type="dxa" w:w="60"/>
-              <w:right w:type="dxa" w:w="100"/>
-            </w:tcMar>
-          </w:tcPr>
-          <w:p>
-            <w:pPr>
-              <w:spacing w:after="0" w:line="252"/>
-            </w:pPr>
+            <w:r>
+              <w:rPr>
+                <w:rFonts w:ascii="Calibri" w:cs="Calibri" w:eastAsia="Calibri" w:hAnsi="Calibri"/>
+                <w:color w:val="1D3557"/>
+                <w:sz w:val="18"/>
+                <w:szCs w:val="18"/>
+              </w:rPr>
+              <w:t xml:space="preserve">Por validar</w:t>
+            </w:r>
+          </w:p>
+        </w:tc>
+        <w:tc>
+          <w:tcPr>
+            <w:tcW w:type="dxa" w:w="800"/>
+            <w:tcBorders>
+              <w:top w:val="single" w:color="C9D4DF" w:sz="4"/>
+              <w:left w:val="single" w:color="C9D4DF" w:sz="4"/>
+              <w:bottom w:val="single" w:color="C9D4DF" w:sz="4"/>
+              <w:right w:val="single" w:color="C9D4DF" w:sz="4"/>
+            </w:tcBorders>
+            <w:tcMar>
+              <w:top w:type="dxa" w:w="60"/>
+              <w:left w:type="dxa" w:w="100"/>
+              <w:bottom w:type="dxa" w:w="60"/>
+              <w:right w:type="dxa" w:w="100"/>
+            </w:tcMar>
+          </w:tcPr>
+          <w:p>
+            <w:pPr>
+              <w:spacing w:after="0" w:line="252"/>
+            </w:pPr>
+            <w:r>
+              <w:rPr>
+                <w:rFonts w:ascii="Calibri" w:cs="Calibri" w:eastAsia="Calibri" w:hAnsi="Calibri"/>
+                <w:color w:val="1D3557"/>
+                <w:sz w:val="18"/>
+                <w:szCs w:val="18"/>
+              </w:rPr>
+              <w:t xml:space="preserve">N5</w:t>
+            </w:r>
           </w:p>
         </w:tc>
       </w:tr>
@@ -3277,7 +3307,7 @@
           <w:sz w:val="20"/>
           <w:szCs w:val="20"/>
         </w:rPr>
-        <w:t xml:space="preserve">Guarden como anexo las capturas del resumen de Google Forms y las notas de cada entrevista. No escriban nombres ni teléfonos de los participantes (Ley 1581 de 2012).</w:t>
+        <w:t xml:space="preserve">Al aplicar la encuesta, guarden la captura del resumen de Google Forms y las notas de cada entrevista como anexo. No escriban nombres ni teléfonos de los participantes (Ley 1581 de 2012).</w:t>
       </w:r>
     </w:p>
     <w:p>
@@ -19002,7 +19032,7 @@
           <w:sz w:val="22"/>
           <w:szCs w:val="22"/>
         </w:rPr>
-        <w:t xml:space="preserve">El punto débil es la evidencia primaria: las necesidades N1, N2 y N3 están respaldadas por fuentes públicas, pero falta confirmarlas con la encuesta y las entrevistas a cartageneros (tabla de evidencias C1 a C5).</w:t>
+        <w:t xml:space="preserve">Las necesidades N1, N2 y N3 están respaldadas por fuentes públicas (E1 a E6). El siguiente paso es aplicar la encuesta y las entrevistas para confirmar o descartar las hipótesis C1 a C5 con cartageneros; si alguna se descarta, se revisa la prioridad de los requisitos que dependen de ella.</w:t>
       </w:r>
     </w:p>
     <w:p>
@@ -19344,7 +19374,7 @@
           <w:numId w:val="4"/>
         </w:numPr>
       </w:pPr>
-      <w:hyperlink w:history="1" r:id="rId_cyeqhgzwdy_dqopktpji">
+      <w:hyperlink w:history="1" r:id="rIdbmwu6vcpoo9btneve-1cd">
         <w:r>
           <w:rPr>
             <w:rStyle w:val="Hyperlink"/>
@@ -19364,7 +19394,7 @@
           <w:numId w:val="4"/>
         </w:numPr>
       </w:pPr>
-      <w:hyperlink w:history="1" r:id="rIdps-g2tbommaymyio8_eiq">
+      <w:hyperlink w:history="1" r:id="rIdpitbircaoddggzmtyralq">
         <w:r>
           <w:rPr>
             <w:rStyle w:val="Hyperlink"/>
@@ -19384,7 +19414,7 @@
           <w:numId w:val="4"/>
         </w:numPr>
       </w:pPr>
-      <w:hyperlink w:history="1" r:id="rId0lo-n1b5zxq41dv6ialma">
+      <w:hyperlink w:history="1" r:id="rIdo_eqzemlhjvicbm8oew9z">
         <w:r>
           <w:rPr>
             <w:rStyle w:val="Hyperlink"/>
@@ -19404,7 +19434,7 @@
           <w:numId w:val="4"/>
         </w:numPr>
       </w:pPr>
-      <w:hyperlink w:history="1" r:id="rIdse6ns9eol_apdnazfzolz">
+      <w:hyperlink w:history="1" r:id="rIdp4gbwodxzqf1flhscgnqq">
         <w:r>
           <w:rPr>
             <w:rStyle w:val="Hyperlink"/>
@@ -19424,7 +19454,7 @@
           <w:numId w:val="4"/>
         </w:numPr>
       </w:pPr>
-      <w:hyperlink w:history="1" r:id="rIdtlul94npglpswwxvc6ole">
+      <w:hyperlink w:history="1" r:id="rIdvv3qybfxnnkbvg5oresxw">
         <w:r>
           <w:rPr>
             <w:rStyle w:val="Hyperlink"/>

</xml_diff>